<commit_message>
Fix: Commercial_Invoice template - convert to proper docxtpl syntax with {%tr for item in items %} and consistent variable naming
</commit_message>
<xml_diff>
--- a/templates/Commercial_Invoice.docx
+++ b/templates/Commercial_Invoice.docx
@@ -2525,9 +2525,9 @@
                 <w:szCs w:val="18"/>
               </w:rPr>
               <w:t>
-                {% for it in items %}{{ it.quantity }}
+                {%tr for item in items %}{{ item.quantity }}
                 <w:br/>
-                {{ it.amount_usd }}{% endfor %}
+                {{ item.amount_usd }}{%tr endfor %}
               </w:t>
             </w:r>
           </w:p>
@@ -2610,9 +2610,9 @@
                 <w:szCs w:val="18"/>
               </w:rPr>
               <w:t>
-                {% for it in items %}${{ it.hsn_code }}
+                {%tr for item in items %}${{ item.hsn_code }}
                 <w:br/>
-                {{ it.rate_per_unit }}{% endfor %}
+                {{ item.rate_per_unit }}{%tr endfor %}
               </w:t>
             </w:r>
           </w:p>

</xml_diff>

<commit_message>
Fix: Revert to proper Jinja2 syntax {% for item in items %} with consistent item variable naming
</commit_message>
<xml_diff>
--- a/templates/Commercial_Invoice.docx
+++ b/templates/Commercial_Invoice.docx
@@ -2525,9 +2525,9 @@
                 <w:szCs w:val="18"/>
               </w:rPr>
               <w:t>
-                {%tr for item in items %}{{ item.quantity }}
+                {% for item in items %}{{ item.quantity }}
                 <w:br/>
-                {{ item.amount_usd }}{%tr endfor %}
+                {{ item.amount_usd }}{% endfor %}
               </w:t>
             </w:r>
           </w:p>
@@ -2610,9 +2610,9 @@
                 <w:szCs w:val="18"/>
               </w:rPr>
               <w:t>
-                {%tr for item in items %}${{ item.hsn_code }}
+                {% for item in items %}${{ item.hsn_code }}
                 <w:br/>
-                {{ item.rate_per_unit }}{%tr endfor %}
+                {{ item.rate_per_unit }}{% endfor %}
               </w:t>
             </w:r>
           </w:p>

</xml_diff>

<commit_message>
Fix: Restore original template structure with consistent 'item' variable naming
</commit_message>
<xml_diff>
--- a/templates/Commercial_Invoice.docx
+++ b/templates/Commercial_Invoice.docx
@@ -2524,11 +2524,7 @@
                 <w:sz w:val="18"/>
                 <w:szCs w:val="18"/>
               </w:rPr>
-              <w:t>
-                {% for item in items %}{{ item.quantity }}
-                <w:br/>
-                {{ item.amount_usd }}{% endfor %}
-              </w:t>
+              <w:t>{% for item in items %}{{ item.quantity }}{% endfor %}</w:t>
             </w:r>
           </w:p>
           <w:p>
@@ -2609,11 +2605,7 @@
                 <w:sz w:val="18"/>
                 <w:szCs w:val="18"/>
               </w:rPr>
-              <w:t>
-                {% for item in items %}${{ item.hsn_code }}
-                <w:br/>
-                {{ item.rate_per_unit }}{% endfor %}
-              </w:t>
+              <w:t>{% for item in items %}${{ item.rate_per_unit }}{% endfor %}</w:t>
             </w:r>
           </w:p>
           <w:p>
@@ -2912,13 +2904,7 @@
                 <w:sz w:val="18"/>
                 <w:szCs w:val="18"/>
               </w:rPr>
-              <w:t>
-                ${{ total_cif_usd }}
-                <w:br/>
-                {{ freight_usd }}
-                <w:br/>
-                {{ total_fob_usd }}
-              </w:t>
+              <w:t>${{ total_cif_usd }}</w:t>
             </w:r>
           </w:p>
           <w:p>

</xml_diff>